<commit_message>
Adiciona slides (Quarto/reveal.js) da videoaula do capítulo 21
- 21 slides na ordem do mapa do roteiro, com notas do apresentador
- gráficos gerados a partir da base do SIM/RJ (689.048 registros)
- ajuste no roteiro: mediana masculina (66 anos) e leitura das facetas
</commit_message>
<xml_diff>
--- a/Roteiro de Gravação - Cap21 Visualização de Dados.docx
+++ b/Roteiro de Gravação - Cap21 Visualização de Dados.docx
@@ -4363,7 +4363,7 @@
           <w:i w:val="0"/>
           <w:sz w:val="22"/>
         </w:rPr>
-        <w:t>[slide 15] Se preferir uma leitura por quartis, o boxplot entrega a mesma mensagem de forma mais compacta: a mediana feminina fica perto dos 75 anos; a masculina, perto dos 62. Treze anos de diferença, visíveis em um único gráfico.</w:t>
+        <w:t>[slide 15] Se preferir uma leitura por quartis, o boxplot entrega a mesma mensagem de forma mais compacta: a mediana feminina fica perto dos 75 anos; a masculina, perto dos 66. Nove anos de diferença, visíveis em um único gráfico.</w:t>
       </w:r>
     </w:p>
     <w:p>
@@ -4402,7 +4402,7 @@
           <w:i w:val="0"/>
           <w:sz w:val="22"/>
         </w:rPr>
-        <w:t>. Uma linha de código — facet_wrap — e o ggplot2 replica o gráfico por grupo mantendo a mesma escala. E aí aparece um achado que só a comparação revela: em maio, a mortalidade masculina dispara muito mais do que a feminina.</w:t>
+        <w:t>. Uma linha de código — facet_wrap — e o ggplot2 replica o gráfico por grupo mantendo a mesma escala. E aí aparece um achado que só a comparação revela: a forma da sazonalidade é praticamente a mesma nos dois grupos — o que muda é a magnitude, e não o padrão.</w:t>
       </w:r>
     </w:p>
     <w:p>

</xml_diff>